<commit_message>
Final delivery report draft
</commit_message>
<xml_diff>
--- a/report/emi03_final_delivery.docx
+++ b/report/emi03_final_delivery.docx
@@ -3,130 +3,324 @@
 <w:document xmlns:wpc="http://schemas.microsoft.com/office/word/2010/wordprocessingCanvas" xmlns:cx="http://schemas.microsoft.com/office/drawing/2014/chartex" xmlns:cx1="http://schemas.microsoft.com/office/drawing/2015/9/8/chartex" xmlns:cx2="http://schemas.microsoft.com/office/drawing/2015/10/21/chartex" xmlns:cx3="http://schemas.microsoft.com/office/drawing/2016/5/9/chartex" xmlns:cx4="http://schemas.microsoft.com/office/drawing/2016/5/10/chartex" xmlns:cx5="http://schemas.microsoft.com/office/drawing/2016/5/11/chartex" xmlns:cx6="http://schemas.microsoft.com/office/drawing/2016/5/12/chartex" xmlns:cx7="http://schemas.microsoft.com/office/drawing/2016/5/13/chartex" xmlns:cx8="http://schemas.microsoft.com/office/drawing/2016/5/14/chartex" xmlns:mc="http://schemas.openxmlformats.org/markup-compatibility/2006" xmlns:aink="http://schemas.microsoft.com/office/drawing/2016/ink" xmlns:am3d="http://schemas.microsoft.com/office/drawing/2017/model3d" xmlns:o="urn:schemas-microsoft-com:office:office" xmlns:oel="http://schemas.microsoft.com/office/2019/extlst" xmlns:r="http://schemas.openxmlformats.org/officeDocument/2006/relationships" xmlns:m="http://schemas.openxmlformats.org/officeDocument/2006/math" xmlns:v="urn:schemas-microsoft-com:vml" xmlns:wp14="http://schemas.microsoft.com/office/word/2010/wordprocessingDrawing" xmlns:wp="http://schemas.openxmlformats.org/drawingml/2006/wordprocessingDrawing" xmlns:w10="urn:schemas-microsoft-com:office:word" xmlns:w="http://schemas.openxmlformats.org/wordprocessingml/2006/main" xmlns:w14="http://schemas.microsoft.com/office/word/2010/wordml" xmlns:w15="http://schemas.microsoft.com/office/word/2012/wordml" xmlns:w16cex="http://schemas.microsoft.com/office/word/2018/wordml/cex" xmlns:w16cid="http://schemas.microsoft.com/office/word/2016/wordml/cid" xmlns:w16="http://schemas.microsoft.com/office/word/2018/wordml" xmlns:w16du="http://schemas.microsoft.com/office/word/2023/wordml/word16du" xmlns:w16sdtdh="http://schemas.microsoft.com/office/word/2020/wordml/sdtdatahash" xmlns:w16sdtfl="http://schemas.microsoft.com/office/word/2024/wordml/sdtformatlock" xmlns:w16se="http://schemas.microsoft.com/office/word/2015/wordml/symex" xmlns:wpg="http://schemas.microsoft.com/office/word/2010/wordprocessingGroup" xmlns:wpi="http://schemas.microsoft.com/office/word/2010/wordprocessingInk" xmlns:wne="http://schemas.microsoft.com/office/word/2006/wordml" xmlns:wps="http://schemas.microsoft.com/office/word/2010/wordprocessingShape" mc:Ignorable="w14 w15 w16se w16cid w16 w16cex w16sdtdh w16sdtfl w16du wp14">
   <w:body>
     <w:p>
+      <w:r>
+        <w:rPr>
+          <w:noProof/>
+        </w:rPr>
+        <w:pict w14:anchorId="5B3C0F64">
+          <v:shapetype id="_x0000_t202" coordsize="21600,21600" o:spt="202" path="m,l,21600r21600,l21600,xe">
+            <v:stroke joinstyle="miter"/>
+            <v:path gradientshapeok="t" o:connecttype="rect"/>
+          </v:shapetype>
+          <v:shape id="Text Box 2" o:spid="_x0000_s1028" type="#_x0000_t202" style="position:absolute;margin-left:80.6pt;margin-top:353.15pt;width:355.5pt;height:43.5pt;z-index:251661312;visibility:visible;mso-wrap-style:square;mso-width-percent:0;mso-height-percent:0;mso-wrap-distance-left:9pt;mso-wrap-distance-top:3.6pt;mso-wrap-distance-right:9pt;mso-wrap-distance-bottom:3.6pt;mso-position-horizontal:absolute;mso-position-horizontal-relative:text;mso-position-vertical:absolute;mso-position-vertical-relative:page;mso-width-percent:0;mso-height-percent:0;mso-width-relative:margin;mso-height-relative:margin;v-text-anchor:top" o:gfxdata="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" filled="f" stroked="f">
+            <v:textbox>
+              <w:txbxContent>
+                <w:p>
+                  <w:pPr>
+                    <w:rPr>
+                      <w:b/>
+                      <w:color w:val="FEFEFE"/>
+                      <w:spacing w:val="10"/>
+                      <w:sz w:val="36"/>
+                      <w:szCs w:val="36"/>
+                    </w:rPr>
+                  </w:pPr>
+                  <w:r>
+                    <w:rPr>
+                      <w:b/>
+                      <w:color w:val="FEFEFE"/>
+                      <w:spacing w:val="10"/>
+                      <w:sz w:val="36"/>
+                      <w:szCs w:val="36"/>
+                    </w:rPr>
+                    <w:t>ON-PREMISES MLOPS COCKPIT</w:t>
+                  </w:r>
+                </w:p>
+              </w:txbxContent>
+            </v:textbox>
+            <w10:wrap anchory="page"/>
+          </v:shape>
+        </w:pict>
+      </w:r>
+      <w:r>
+        <w:rPr>
+          <w:noProof/>
+        </w:rPr>
+        <w:drawing>
+          <wp:anchor distT="0" distB="0" distL="114300" distR="114300" simplePos="0" relativeHeight="251664384" behindDoc="0" locked="0" layoutInCell="1" allowOverlap="1" wp14:anchorId="74575752" wp14:editId="7F935BC3">
+            <wp:simplePos x="0" y="0"/>
+            <wp:positionH relativeFrom="column">
+              <wp:posOffset>1097915</wp:posOffset>
+            </wp:positionH>
+            <wp:positionV relativeFrom="page">
+              <wp:posOffset>3399117</wp:posOffset>
+            </wp:positionV>
+            <wp:extent cx="3634740" cy="986790"/>
+            <wp:effectExtent l="0" t="0" r="3810" b="3810"/>
+            <wp:wrapNone/>
+            <wp:docPr id="1029467976" name="Picture 1"/>
+            <wp:cNvGraphicFramePr>
+              <a:graphicFrameLocks xmlns:a="http://schemas.openxmlformats.org/drawingml/2006/main" noChangeAspect="1"/>
+            </wp:cNvGraphicFramePr>
+            <a:graphic xmlns:a="http://schemas.openxmlformats.org/drawingml/2006/main">
+              <a:graphicData uri="http://schemas.openxmlformats.org/drawingml/2006/picture">
+                <pic:pic xmlns:pic="http://schemas.openxmlformats.org/drawingml/2006/picture">
+                  <pic:nvPicPr>
+                    <pic:cNvPr id="1029467976" name=""/>
+                    <pic:cNvPicPr/>
+                  </pic:nvPicPr>
+                  <pic:blipFill>
+                    <a:blip r:embed="rId7" cstate="print">
+                      <a:extLst>
+                        <a:ext uri="{28A0092B-C50C-407E-A947-70E740481C1C}">
+                          <a14:useLocalDpi xmlns:a14="http://schemas.microsoft.com/office/drawing/2010/main" val="0"/>
+                        </a:ext>
+                      </a:extLst>
+                    </a:blip>
+                    <a:stretch>
+                      <a:fillRect/>
+                    </a:stretch>
+                  </pic:blipFill>
+                  <pic:spPr>
+                    <a:xfrm>
+                      <a:off x="0" y="0"/>
+                      <a:ext cx="3634740" cy="986790"/>
+                    </a:xfrm>
+                    <a:prstGeom prst="rect">
+                      <a:avLst/>
+                    </a:prstGeom>
+                  </pic:spPr>
+                </pic:pic>
+              </a:graphicData>
+            </a:graphic>
+            <wp14:sizeRelH relativeFrom="margin">
+              <wp14:pctWidth>0</wp14:pctWidth>
+            </wp14:sizeRelH>
+            <wp14:sizeRelV relativeFrom="margin">
+              <wp14:pctHeight>0</wp14:pctHeight>
+            </wp14:sizeRelV>
+          </wp:anchor>
+        </w:drawing>
+      </w:r>
+      <w:r>
+        <w:rPr>
+          <w:noProof/>
+        </w:rPr>
+        <w:drawing>
+          <wp:anchor distT="0" distB="0" distL="114300" distR="114300" simplePos="0" relativeHeight="251659264" behindDoc="1" locked="0" layoutInCell="1" allowOverlap="1" wp14:anchorId="6F6BA870" wp14:editId="1029B7F1">
+            <wp:simplePos x="0" y="0"/>
+            <wp:positionH relativeFrom="column">
+              <wp:posOffset>-926874</wp:posOffset>
+            </wp:positionH>
+            <wp:positionV relativeFrom="page">
+              <wp:posOffset>-93823</wp:posOffset>
+            </wp:positionV>
+            <wp:extent cx="7583805" cy="10814685"/>
+            <wp:effectExtent l="0" t="0" r="0" b="5715"/>
+            <wp:wrapNone/>
+            <wp:docPr id="100617615" name="Picture 1"/>
+            <wp:cNvGraphicFramePr>
+              <a:graphicFrameLocks xmlns:a="http://schemas.openxmlformats.org/drawingml/2006/main" noChangeAspect="1"/>
+            </wp:cNvGraphicFramePr>
+            <a:graphic xmlns:a="http://schemas.openxmlformats.org/drawingml/2006/main">
+              <a:graphicData uri="http://schemas.openxmlformats.org/drawingml/2006/picture">
+                <pic:pic xmlns:pic="http://schemas.openxmlformats.org/drawingml/2006/picture">
+                  <pic:nvPicPr>
+                    <pic:cNvPr id="100617615" name=""/>
+                    <pic:cNvPicPr/>
+                  </pic:nvPicPr>
+                  <pic:blipFill>
+                    <a:blip r:embed="rId8">
+                      <a:alphaModFix amt="91000"/>
+                      <a:extLst>
+                        <a:ext uri="{BEBA8EAE-BF5A-486C-A8C5-ECC9F3942E4B}">
+                          <a14:imgProps xmlns:a14="http://schemas.microsoft.com/office/drawing/2010/main">
+                            <a14:imgLayer r:embed="rId9">
+                              <a14:imgEffect>
+                                <a14:sharpenSoften amount="5000"/>
+                              </a14:imgEffect>
+                              <a14:imgEffect>
+                                <a14:colorTemperature colorTemp="5623"/>
+                              </a14:imgEffect>
+                              <a14:imgEffect>
+                                <a14:saturation sat="106000"/>
+                              </a14:imgEffect>
+                              <a14:imgEffect>
+                                <a14:brightnessContrast bright="8000" contrast="8000"/>
+                              </a14:imgEffect>
+                            </a14:imgLayer>
+                          </a14:imgProps>
+                        </a:ext>
+                        <a:ext uri="{28A0092B-C50C-407E-A947-70E740481C1C}">
+                          <a14:useLocalDpi xmlns:a14="http://schemas.microsoft.com/office/drawing/2010/main" val="0"/>
+                        </a:ext>
+                      </a:extLst>
+                    </a:blip>
+                    <a:stretch>
+                      <a:fillRect/>
+                    </a:stretch>
+                  </pic:blipFill>
+                  <pic:spPr>
+                    <a:xfrm>
+                      <a:off x="0" y="0"/>
+                      <a:ext cx="7583805" cy="10814685"/>
+                    </a:xfrm>
+                    <a:prstGeom prst="rect">
+                      <a:avLst/>
+                    </a:prstGeom>
+                    <a:effectLst>
+                      <a:glow>
+                        <a:schemeClr val="accent1"/>
+                      </a:glow>
+                    </a:effectLst>
+                  </pic:spPr>
+                </pic:pic>
+              </a:graphicData>
+            </a:graphic>
+            <wp14:sizeRelH relativeFrom="margin">
+              <wp14:pctWidth>0</wp14:pctWidth>
+            </wp14:sizeRelH>
+            <wp14:sizeRelV relativeFrom="margin">
+              <wp14:pctHeight>0</wp14:pctHeight>
+            </wp14:sizeRelV>
+          </wp:anchor>
+        </w:drawing>
+      </w:r>
+      <w:r>
+        <w:t xml:space="preserve"> </w:t>
+      </w:r>
+      <w:r>
+        <w:rPr>
+          <w:noProof/>
+        </w:rPr>
+        <w:pict w14:anchorId="55A19117">
+          <v:shape id="_x0000_s1027" type="#_x0000_t202" style="position:absolute;margin-left:103.4pt;margin-top:778.3pt;width:259.2pt;height:33.4pt;z-index:251662336;visibility:visible;mso-wrap-style:square;mso-width-percent:0;mso-height-percent:0;mso-wrap-distance-left:9pt;mso-wrap-distance-top:3.6pt;mso-wrap-distance-right:9pt;mso-wrap-distance-bottom:3.6pt;mso-position-horizontal:absolute;mso-position-horizontal-relative:text;mso-position-vertical:absolute;mso-position-vertical-relative:page;mso-width-percent:0;mso-height-percent:0;mso-width-relative:margin;mso-height-relative:margin;v-text-anchor:top" o:gfxdata="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" filled="f" stroked="f">
+            <v:textbox>
+              <w:txbxContent>
+                <w:p>
+                  <w:pPr>
+                    <w:jc w:val="center"/>
+                    <w:rPr>
+                      <w:b/>
+                      <w:bCs/>
+                      <w:color w:val="FFC000"/>
+                      <w:spacing w:val="34"/>
+                      <w:sz w:val="40"/>
+                      <w:szCs w:val="40"/>
+                    </w:rPr>
+                  </w:pPr>
+                  <w:r>
+                    <w:rPr>
+                      <w:b/>
+                      <w:bCs/>
+                      <w:color w:val="FFC000"/>
+                      <w:spacing w:val="34"/>
+                      <w:sz w:val="40"/>
+                      <w:szCs w:val="40"/>
+                    </w:rPr>
+                    <w:t>EMI3 FINAL DELIVERY</w:t>
+                  </w:r>
+                </w:p>
+              </w:txbxContent>
+            </v:textbox>
+            <w10:wrap anchory="page"/>
+          </v:shape>
+        </w:pict>
+      </w:r>
+      <w:r>
+        <w:rPr>
+          <w:noProof/>
+        </w:rPr>
+        <w:pict w14:anchorId="72730C71">
+          <v:shape id="_x0000_s1026" type="#_x0000_t202" style="position:absolute;margin-left:-68.5pt;margin-top:806pt;width:588pt;height:42.3pt;z-index:251663360;visibility:visible;mso-wrap-style:square;mso-width-percent:0;mso-height-percent:200;mso-wrap-distance-left:9pt;mso-wrap-distance-top:3.6pt;mso-wrap-distance-right:9pt;mso-wrap-distance-bottom:3.6pt;mso-position-horizontal:absolute;mso-position-horizontal-relative:text;mso-position-vertical:absolute;mso-position-vertical-relative:page;mso-width-percent:0;mso-height-percent:200;mso-width-relative:margin;mso-height-relative:margin;v-text-anchor:top" o:gfxdata="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" filled="f" stroked="f">
+            <v:textbox style="mso-fit-shape-to-text:t">
+              <w:txbxContent>
+                <w:p>
+                  <w:pPr>
+                    <w:jc w:val="center"/>
+                    <w:rPr>
+                      <w:color w:val="FFFFFF" w:themeColor="background1"/>
+                      <w:sz w:val="32"/>
+                      <w:szCs w:val="32"/>
+                      <w:lang w:val="pt-PT"/>
+                    </w:rPr>
+                  </w:pPr>
+                  <w:r>
+                    <w:rPr>
+                      <w:color w:val="FFFFFF" w:themeColor="background1"/>
+                      <w:lang w:val="pt-PT"/>
+                    </w:rPr>
+                    <w:t>António Cruz, Bruno Santos, Pedro Miranda, Ricardo Kayseller</w:t>
+                  </w:r>
+                </w:p>
+              </w:txbxContent>
+            </v:textbox>
+            <w10:wrap anchory="page"/>
+          </v:shape>
+        </w:pict>
+      </w:r>
+      <w:r>
+        <w:rPr>
+          <w:noProof/>
+        </w:rPr>
+        <w:drawing>
+          <wp:anchor distT="0" distB="0" distL="114300" distR="114300" simplePos="0" relativeHeight="251660288" behindDoc="0" locked="0" layoutInCell="1" allowOverlap="1" wp14:anchorId="48AE6EFA" wp14:editId="66E440F6">
+            <wp:simplePos x="0" y="0"/>
+            <wp:positionH relativeFrom="column">
+              <wp:posOffset>-226060</wp:posOffset>
+            </wp:positionH>
+            <wp:positionV relativeFrom="page">
+              <wp:posOffset>702945</wp:posOffset>
+            </wp:positionV>
+            <wp:extent cx="2420471" cy="383476"/>
+            <wp:effectExtent l="0" t="0" r="0" b="0"/>
+            <wp:wrapNone/>
+            <wp:docPr id="840495478" name="Picture 1"/>
+            <wp:cNvGraphicFramePr>
+              <a:graphicFrameLocks xmlns:a="http://schemas.openxmlformats.org/drawingml/2006/main" noChangeAspect="1"/>
+            </wp:cNvGraphicFramePr>
+            <a:graphic xmlns:a="http://schemas.openxmlformats.org/drawingml/2006/main">
+              <a:graphicData uri="http://schemas.openxmlformats.org/drawingml/2006/picture">
+                <pic:pic xmlns:pic="http://schemas.openxmlformats.org/drawingml/2006/picture">
+                  <pic:nvPicPr>
+                    <pic:cNvPr id="840495478" name=""/>
+                    <pic:cNvPicPr/>
+                  </pic:nvPicPr>
+                  <pic:blipFill>
+                    <a:blip r:embed="rId10" cstate="print">
+                      <a:extLst>
+                        <a:ext uri="{28A0092B-C50C-407E-A947-70E740481C1C}">
+                          <a14:useLocalDpi xmlns:a14="http://schemas.microsoft.com/office/drawing/2010/main" val="0"/>
+                        </a:ext>
+                      </a:extLst>
+                    </a:blip>
+                    <a:stretch>
+                      <a:fillRect/>
+                    </a:stretch>
+                  </pic:blipFill>
+                  <pic:spPr>
+                    <a:xfrm>
+                      <a:off x="0" y="0"/>
+                      <a:ext cx="2420471" cy="383476"/>
+                    </a:xfrm>
+                    <a:prstGeom prst="rect">
+                      <a:avLst/>
+                    </a:prstGeom>
+                  </pic:spPr>
+                </pic:pic>
+              </a:graphicData>
+            </a:graphic>
+            <wp14:sizeRelH relativeFrom="margin">
+              <wp14:pctWidth>0</wp14:pctWidth>
+            </wp14:sizeRelH>
+          </wp:anchor>
+        </w:drawing>
+      </w:r>
+    </w:p>
+    <w:p>
       <w:pPr>
         <w:jc w:val="center"/>
       </w:pPr>
-      <w:r>
-        <w:rPr>
-          <w:sz w:val="32"/>
-        </w:rPr>
-        <w:br/>
-      </w:r>
-      <w:r>
-        <w:rPr>
-          <w:sz w:val="32"/>
-        </w:rPr>
-        <w:br/>
-      </w:r>
-      <w:r>
-        <w:rPr>
-          <w:sz w:val="32"/>
-        </w:rPr>
-        <w:br/>
-      </w:r>
-      <w:r>
-        <w:rPr>
-          <w:sz w:val="32"/>
-        </w:rPr>
-        <w:br/>
-      </w:r>
-      <w:r>
-        <w:rPr>
-          <w:sz w:val="32"/>
-        </w:rPr>
-        <w:br/>
-      </w:r>
-      <w:r>
-        <w:rPr>
-          <w:sz w:val="32"/>
-        </w:rPr>
-        <w:br/>
-      </w:r>
-      <w:r>
-        <w:rPr>
-          <w:sz w:val="32"/>
-        </w:rPr>
-        <w:br/>
-      </w:r>
-      <w:r>
-        <w:rPr>
-          <w:sz w:val="32"/>
-        </w:rPr>
-        <w:br/>
-      </w:r>
-      <w:r>
-        <w:rPr>
-          <w:sz w:val="32"/>
-        </w:rPr>
-        <w:br/>
-      </w:r>
-      <w:r>
-        <w:rPr>
-          <w:sz w:val="32"/>
-        </w:rPr>
-        <w:br/>
-      </w:r>
-      <w:r>
-        <w:rPr>
-          <w:sz w:val="32"/>
-        </w:rPr>
-        <w:br/>
-      </w:r>
-      <w:r>
-        <w:rPr>
-          <w:sz w:val="32"/>
-        </w:rPr>
-        <w:br/>
-      </w:r>
-      <w:r>
-        <w:rPr>
-          <w:sz w:val="32"/>
-        </w:rPr>
-        <w:br/>
-      </w:r>
-      <w:r>
-        <w:rPr>
-          <w:sz w:val="32"/>
-        </w:rPr>
-        <w:br/>
-      </w:r>
-      <w:r>
-        <w:rPr>
-          <w:sz w:val="32"/>
-        </w:rPr>
-        <w:br/>
-      </w:r>
-      <w:r>
-        <w:rPr>
-          <w:sz w:val="32"/>
-        </w:rPr>
-        <w:br/>
-      </w:r>
-      <w:r>
-        <w:rPr>
-          <w:sz w:val="32"/>
-        </w:rPr>
-        <w:br/>
-      </w:r>
-      <w:r>
-        <w:rPr>
-          <w:sz w:val="32"/>
-        </w:rPr>
-        <w:br/>
-      </w:r>
-      <w:r>
-        <w:rPr>
-          <w:color w:val="B6B6B6"/>
-          <w:sz w:val="32"/>
-        </w:rPr>
-        <w:t>INSERT YOUR COVER PAGE HERE</w:t>
-      </w:r>
-      <w:r>
-        <w:rPr>
-          <w:sz w:val="32"/>
-        </w:rPr>
-        <w:br/>
-      </w:r>
       <w:r>
         <w:rPr>
           <w:sz w:val="32"/>
@@ -185,7 +379,7 @@
           <w:r>
             <w:fldChar w:fldCharType="separate"/>
           </w:r>
-          <w:hyperlink w:anchor="_Toc226575365" w:history="1">
+          <w:hyperlink w:anchor="_Toc226576166" w:history="1">
             <w:r>
               <w:rPr>
                 <w:rStyle w:val="Hyperlink"/>
@@ -212,7 +406,7 @@
                 <w:noProof/>
                 <w:webHidden/>
               </w:rPr>
-              <w:instrText xml:space="preserve"> PAGEREF _Toc226575365 \h </w:instrText>
+              <w:instrText xml:space="preserve"> PAGEREF _Toc226576166 \h </w:instrText>
             </w:r>
             <w:r>
               <w:rPr>
@@ -257,7 +451,7 @@
               <w14:ligatures w14:val="standardContextual"/>
             </w:rPr>
           </w:pPr>
-          <w:hyperlink w:anchor="_Toc226575366" w:history="1">
+          <w:hyperlink w:anchor="_Toc226576167" w:history="1">
             <w:r>
               <w:rPr>
                 <w:rStyle w:val="Hyperlink"/>
@@ -284,7 +478,7 @@
                 <w:noProof/>
                 <w:webHidden/>
               </w:rPr>
-              <w:instrText xml:space="preserve"> PAGEREF _Toc226575366 \h </w:instrText>
+              <w:instrText xml:space="preserve"> PAGEREF _Toc226576167 \h </w:instrText>
             </w:r>
             <w:r>
               <w:rPr>
@@ -329,7 +523,7 @@
               <w14:ligatures w14:val="standardContextual"/>
             </w:rPr>
           </w:pPr>
-          <w:hyperlink w:anchor="_Toc226575367" w:history="1">
+          <w:hyperlink w:anchor="_Toc226576168" w:history="1">
             <w:r>
               <w:rPr>
                 <w:rStyle w:val="Hyperlink"/>
@@ -356,7 +550,7 @@
                 <w:noProof/>
                 <w:webHidden/>
               </w:rPr>
-              <w:instrText xml:space="preserve"> PAGEREF _Toc226575367 \h </w:instrText>
+              <w:instrText xml:space="preserve"> PAGEREF _Toc226576168 \h </w:instrText>
             </w:r>
             <w:r>
               <w:rPr>
@@ -401,7 +595,7 @@
               <w14:ligatures w14:val="standardContextual"/>
             </w:rPr>
           </w:pPr>
-          <w:hyperlink w:anchor="_Toc226575368" w:history="1">
+          <w:hyperlink w:anchor="_Toc226576169" w:history="1">
             <w:r>
               <w:rPr>
                 <w:rStyle w:val="Hyperlink"/>
@@ -428,7 +622,7 @@
                 <w:noProof/>
                 <w:webHidden/>
               </w:rPr>
-              <w:instrText xml:space="preserve"> PAGEREF _Toc226575368 \h </w:instrText>
+              <w:instrText xml:space="preserve"> PAGEREF _Toc226576169 \h </w:instrText>
             </w:r>
             <w:r>
               <w:rPr>
@@ -473,7 +667,7 @@
               <w14:ligatures w14:val="standardContextual"/>
             </w:rPr>
           </w:pPr>
-          <w:hyperlink w:anchor="_Toc226575369" w:history="1">
+          <w:hyperlink w:anchor="_Toc226576170" w:history="1">
             <w:r>
               <w:rPr>
                 <w:rStyle w:val="Hyperlink"/>
@@ -500,7 +694,7 @@
                 <w:noProof/>
                 <w:webHidden/>
               </w:rPr>
-              <w:instrText xml:space="preserve"> PAGEREF _Toc226575369 \h </w:instrText>
+              <w:instrText xml:space="preserve"> PAGEREF _Toc226576170 \h </w:instrText>
             </w:r>
             <w:r>
               <w:rPr>
@@ -545,7 +739,7 @@
               <w14:ligatures w14:val="standardContextual"/>
             </w:rPr>
           </w:pPr>
-          <w:hyperlink w:anchor="_Toc226575370" w:history="1">
+          <w:hyperlink w:anchor="_Toc226576171" w:history="1">
             <w:r>
               <w:rPr>
                 <w:rStyle w:val="Hyperlink"/>
@@ -572,7 +766,7 @@
                 <w:noProof/>
                 <w:webHidden/>
               </w:rPr>
-              <w:instrText xml:space="preserve"> PAGEREF _Toc226575370 \h </w:instrText>
+              <w:instrText xml:space="preserve"> PAGEREF _Toc226576171 \h </w:instrText>
             </w:r>
             <w:r>
               <w:rPr>
@@ -617,7 +811,7 @@
               <w14:ligatures w14:val="standardContextual"/>
             </w:rPr>
           </w:pPr>
-          <w:hyperlink w:anchor="_Toc226575371" w:history="1">
+          <w:hyperlink w:anchor="_Toc226576172" w:history="1">
             <w:r>
               <w:rPr>
                 <w:rStyle w:val="Hyperlink"/>
@@ -644,7 +838,7 @@
                 <w:noProof/>
                 <w:webHidden/>
               </w:rPr>
-              <w:instrText xml:space="preserve"> PAGEREF _Toc226575371 \h </w:instrText>
+              <w:instrText xml:space="preserve"> PAGEREF _Toc226576172 \h </w:instrText>
             </w:r>
             <w:r>
               <w:rPr>
@@ -689,7 +883,7 @@
               <w14:ligatures w14:val="standardContextual"/>
             </w:rPr>
           </w:pPr>
-          <w:hyperlink w:anchor="_Toc226575372" w:history="1">
+          <w:hyperlink w:anchor="_Toc226576173" w:history="1">
             <w:r>
               <w:rPr>
                 <w:rStyle w:val="Hyperlink"/>
@@ -716,7 +910,7 @@
                 <w:noProof/>
                 <w:webHidden/>
               </w:rPr>
-              <w:instrText xml:space="preserve"> PAGEREF _Toc226575372 \h </w:instrText>
+              <w:instrText xml:space="preserve"> PAGEREF _Toc226576173 \h </w:instrText>
             </w:r>
             <w:r>
               <w:rPr>
@@ -761,7 +955,7 @@
               <w14:ligatures w14:val="standardContextual"/>
             </w:rPr>
           </w:pPr>
-          <w:hyperlink w:anchor="_Toc226575373" w:history="1">
+          <w:hyperlink w:anchor="_Toc226576174" w:history="1">
             <w:r>
               <w:rPr>
                 <w:rStyle w:val="Hyperlink"/>
@@ -788,7 +982,7 @@
                 <w:noProof/>
                 <w:webHidden/>
               </w:rPr>
-              <w:instrText xml:space="preserve"> PAGEREF _Toc226575373 \h </w:instrText>
+              <w:instrText xml:space="preserve"> PAGEREF _Toc226576174 \h </w:instrText>
             </w:r>
             <w:r>
               <w:rPr>
@@ -833,7 +1027,7 @@
               <w14:ligatures w14:val="standardContextual"/>
             </w:rPr>
           </w:pPr>
-          <w:hyperlink w:anchor="_Toc226575374" w:history="1">
+          <w:hyperlink w:anchor="_Toc226576175" w:history="1">
             <w:r>
               <w:rPr>
                 <w:rStyle w:val="Hyperlink"/>
@@ -860,7 +1054,7 @@
                 <w:noProof/>
                 <w:webHidden/>
               </w:rPr>
-              <w:instrText xml:space="preserve"> PAGEREF _Toc226575374 \h </w:instrText>
+              <w:instrText xml:space="preserve"> PAGEREF _Toc226576175 \h </w:instrText>
             </w:r>
             <w:r>
               <w:rPr>
@@ -905,7 +1099,7 @@
               <w14:ligatures w14:val="standardContextual"/>
             </w:rPr>
           </w:pPr>
-          <w:hyperlink w:anchor="_Toc226575375" w:history="1">
+          <w:hyperlink w:anchor="_Toc226576176" w:history="1">
             <w:r>
               <w:rPr>
                 <w:rStyle w:val="Hyperlink"/>
@@ -932,7 +1126,7 @@
                 <w:noProof/>
                 <w:webHidden/>
               </w:rPr>
-              <w:instrText xml:space="preserve"> PAGEREF _Toc226575375 \h </w:instrText>
+              <w:instrText xml:space="preserve"> PAGEREF _Toc226576176 \h </w:instrText>
             </w:r>
             <w:r>
               <w:rPr>
@@ -977,7 +1171,7 @@
               <w14:ligatures w14:val="standardContextual"/>
             </w:rPr>
           </w:pPr>
-          <w:hyperlink w:anchor="_Toc226575376" w:history="1">
+          <w:hyperlink w:anchor="_Toc226576177" w:history="1">
             <w:r>
               <w:rPr>
                 <w:rStyle w:val="Hyperlink"/>
@@ -1004,7 +1198,7 @@
                 <w:noProof/>
                 <w:webHidden/>
               </w:rPr>
-              <w:instrText xml:space="preserve"> PAGEREF _Toc226575376 \h </w:instrText>
+              <w:instrText xml:space="preserve"> PAGEREF _Toc226576177 \h </w:instrText>
             </w:r>
             <w:r>
               <w:rPr>
@@ -1049,7 +1243,7 @@
               <w14:ligatures w14:val="standardContextual"/>
             </w:rPr>
           </w:pPr>
-          <w:hyperlink w:anchor="_Toc226575377" w:history="1">
+          <w:hyperlink w:anchor="_Toc226576178" w:history="1">
             <w:r>
               <w:rPr>
                 <w:rStyle w:val="Hyperlink"/>
@@ -1076,7 +1270,7 @@
                 <w:noProof/>
                 <w:webHidden/>
               </w:rPr>
-              <w:instrText xml:space="preserve"> PAGEREF _Toc226575377 \h </w:instrText>
+              <w:instrText xml:space="preserve"> PAGEREF _Toc226576178 \h </w:instrText>
             </w:r>
             <w:r>
               <w:rPr>
@@ -1121,7 +1315,7 @@
               <w14:ligatures w14:val="standardContextual"/>
             </w:rPr>
           </w:pPr>
-          <w:hyperlink w:anchor="_Toc226575378" w:history="1">
+          <w:hyperlink w:anchor="_Toc226576179" w:history="1">
             <w:r>
               <w:rPr>
                 <w:rStyle w:val="Hyperlink"/>
@@ -1148,7 +1342,7 @@
                 <w:noProof/>
                 <w:webHidden/>
               </w:rPr>
-              <w:instrText xml:space="preserve"> PAGEREF _Toc226575378 \h </w:instrText>
+              <w:instrText xml:space="preserve"> PAGEREF _Toc226576179 \h </w:instrText>
             </w:r>
             <w:r>
               <w:rPr>
@@ -1193,7 +1387,7 @@
               <w14:ligatures w14:val="standardContextual"/>
             </w:rPr>
           </w:pPr>
-          <w:hyperlink w:anchor="_Toc226575379" w:history="1">
+          <w:hyperlink w:anchor="_Toc226576180" w:history="1">
             <w:r>
               <w:rPr>
                 <w:rStyle w:val="Hyperlink"/>
@@ -1220,7 +1414,7 @@
                 <w:noProof/>
                 <w:webHidden/>
               </w:rPr>
-              <w:instrText xml:space="preserve"> PAGEREF _Toc226575379 \h </w:instrText>
+              <w:instrText xml:space="preserve"> PAGEREF _Toc226576180 \h </w:instrText>
             </w:r>
             <w:r>
               <w:rPr>
@@ -1265,7 +1459,7 @@
               <w14:ligatures w14:val="standardContextual"/>
             </w:rPr>
           </w:pPr>
-          <w:hyperlink w:anchor="_Toc226575380" w:history="1">
+          <w:hyperlink w:anchor="_Toc226576181" w:history="1">
             <w:r>
               <w:rPr>
                 <w:rStyle w:val="Hyperlink"/>
@@ -1292,7 +1486,7 @@
                 <w:noProof/>
                 <w:webHidden/>
               </w:rPr>
-              <w:instrText xml:space="preserve"> PAGEREF _Toc226575380 \h </w:instrText>
+              <w:instrText xml:space="preserve"> PAGEREF _Toc226576181 \h </w:instrText>
             </w:r>
             <w:r>
               <w:rPr>
@@ -1337,7 +1531,7 @@
               <w14:ligatures w14:val="standardContextual"/>
             </w:rPr>
           </w:pPr>
-          <w:hyperlink w:anchor="_Toc226575381" w:history="1">
+          <w:hyperlink w:anchor="_Toc226576182" w:history="1">
             <w:r>
               <w:rPr>
                 <w:rStyle w:val="Hyperlink"/>
@@ -1364,7 +1558,7 @@
                 <w:noProof/>
                 <w:webHidden/>
               </w:rPr>
-              <w:instrText xml:space="preserve"> PAGEREF _Toc226575381 \h </w:instrText>
+              <w:instrText xml:space="preserve"> PAGEREF _Toc226576182 \h </w:instrText>
             </w:r>
             <w:r>
               <w:rPr>
@@ -1409,7 +1603,7 @@
               <w14:ligatures w14:val="standardContextual"/>
             </w:rPr>
           </w:pPr>
-          <w:hyperlink w:anchor="_Toc226575382" w:history="1">
+          <w:hyperlink w:anchor="_Toc226576183" w:history="1">
             <w:r>
               <w:rPr>
                 <w:rStyle w:val="Hyperlink"/>
@@ -1436,7 +1630,7 @@
                 <w:noProof/>
                 <w:webHidden/>
               </w:rPr>
-              <w:instrText xml:space="preserve"> PAGEREF _Toc226575382 \h </w:instrText>
+              <w:instrText xml:space="preserve"> PAGEREF _Toc226576183 \h </w:instrText>
             </w:r>
             <w:r>
               <w:rPr>
@@ -1481,7 +1675,7 @@
               <w14:ligatures w14:val="standardContextual"/>
             </w:rPr>
           </w:pPr>
-          <w:hyperlink w:anchor="_Toc226575383" w:history="1">
+          <w:hyperlink w:anchor="_Toc226576184" w:history="1">
             <w:r>
               <w:rPr>
                 <w:rStyle w:val="Hyperlink"/>
@@ -1508,7 +1702,7 @@
                 <w:noProof/>
                 <w:webHidden/>
               </w:rPr>
-              <w:instrText xml:space="preserve"> PAGEREF _Toc226575383 \h </w:instrText>
+              <w:instrText xml:space="preserve"> PAGEREF _Toc226576184 \h </w:instrText>
             </w:r>
             <w:r>
               <w:rPr>
@@ -1553,7 +1747,7 @@
               <w14:ligatures w14:val="standardContextual"/>
             </w:rPr>
           </w:pPr>
-          <w:hyperlink w:anchor="_Toc226575384" w:history="1">
+          <w:hyperlink w:anchor="_Toc226576185" w:history="1">
             <w:r>
               <w:rPr>
                 <w:rStyle w:val="Hyperlink"/>
@@ -1580,7 +1774,7 @@
                 <w:noProof/>
                 <w:webHidden/>
               </w:rPr>
-              <w:instrText xml:space="preserve"> PAGEREF _Toc226575384 \h </w:instrText>
+              <w:instrText xml:space="preserve"> PAGEREF _Toc226576185 \h </w:instrText>
             </w:r>
             <w:r>
               <w:rPr>
@@ -1625,7 +1819,7 @@
               <w14:ligatures w14:val="standardContextual"/>
             </w:rPr>
           </w:pPr>
-          <w:hyperlink w:anchor="_Toc226575385" w:history="1">
+          <w:hyperlink w:anchor="_Toc226576186" w:history="1">
             <w:r>
               <w:rPr>
                 <w:rStyle w:val="Hyperlink"/>
@@ -1652,7 +1846,7 @@
                 <w:noProof/>
                 <w:webHidden/>
               </w:rPr>
-              <w:instrText xml:space="preserve"> PAGEREF _Toc226575385 \h </w:instrText>
+              <w:instrText xml:space="preserve"> PAGEREF _Toc226576186 \h </w:instrText>
             </w:r>
             <w:r>
               <w:rPr>
@@ -1697,7 +1891,7 @@
               <w14:ligatures w14:val="standardContextual"/>
             </w:rPr>
           </w:pPr>
-          <w:hyperlink w:anchor="_Toc226575386" w:history="1">
+          <w:hyperlink w:anchor="_Toc226576187" w:history="1">
             <w:r>
               <w:rPr>
                 <w:rStyle w:val="Hyperlink"/>
@@ -1724,7 +1918,7 @@
                 <w:noProof/>
                 <w:webHidden/>
               </w:rPr>
-              <w:instrText xml:space="preserve"> PAGEREF _Toc226575386 \h </w:instrText>
+              <w:instrText xml:space="preserve"> PAGEREF _Toc226576187 \h </w:instrText>
             </w:r>
             <w:r>
               <w:rPr>
@@ -1769,7 +1963,7 @@
               <w14:ligatures w14:val="standardContextual"/>
             </w:rPr>
           </w:pPr>
-          <w:hyperlink w:anchor="_Toc226575387" w:history="1">
+          <w:hyperlink w:anchor="_Toc226576188" w:history="1">
             <w:r>
               <w:rPr>
                 <w:rStyle w:val="Hyperlink"/>
@@ -1796,7 +1990,7 @@
                 <w:noProof/>
                 <w:webHidden/>
               </w:rPr>
-              <w:instrText xml:space="preserve"> PAGEREF _Toc226575387 \h </w:instrText>
+              <w:instrText xml:space="preserve"> PAGEREF _Toc226576188 \h </w:instrText>
             </w:r>
             <w:r>
               <w:rPr>
@@ -1841,7 +2035,7 @@
               <w14:ligatures w14:val="standardContextual"/>
             </w:rPr>
           </w:pPr>
-          <w:hyperlink w:anchor="_Toc226575388" w:history="1">
+          <w:hyperlink w:anchor="_Toc226576189" w:history="1">
             <w:r>
               <w:rPr>
                 <w:rStyle w:val="Hyperlink"/>
@@ -1868,7 +2062,7 @@
                 <w:noProof/>
                 <w:webHidden/>
               </w:rPr>
-              <w:instrText xml:space="preserve"> PAGEREF _Toc226575388 \h </w:instrText>
+              <w:instrText xml:space="preserve"> PAGEREF _Toc226576189 \h </w:instrText>
             </w:r>
             <w:r>
               <w:rPr>
@@ -1913,7 +2107,7 @@
               <w14:ligatures w14:val="standardContextual"/>
             </w:rPr>
           </w:pPr>
-          <w:hyperlink w:anchor="_Toc226575389" w:history="1">
+          <w:hyperlink w:anchor="_Toc226576190" w:history="1">
             <w:r>
               <w:rPr>
                 <w:rStyle w:val="Hyperlink"/>
@@ -1940,7 +2134,7 @@
                 <w:noProof/>
                 <w:webHidden/>
               </w:rPr>
-              <w:instrText xml:space="preserve"> PAGEREF _Toc226575389 \h </w:instrText>
+              <w:instrText xml:space="preserve"> PAGEREF _Toc226576190 \h </w:instrText>
             </w:r>
             <w:r>
               <w:rPr>
@@ -1985,7 +2179,7 @@
               <w14:ligatures w14:val="standardContextual"/>
             </w:rPr>
           </w:pPr>
-          <w:hyperlink w:anchor="_Toc226575390" w:history="1">
+          <w:hyperlink w:anchor="_Toc226576191" w:history="1">
             <w:r>
               <w:rPr>
                 <w:rStyle w:val="Hyperlink"/>
@@ -2013,7 +2207,7 @@
                 <w:noProof/>
                 <w:webHidden/>
               </w:rPr>
-              <w:instrText xml:space="preserve"> PAGEREF _Toc226575390 \h </w:instrText>
+              <w:instrText xml:space="preserve"> PAGEREF _Toc226576191 \h </w:instrText>
             </w:r>
             <w:r>
               <w:rPr>
@@ -2033,7 +2227,7 @@
                 <w:noProof/>
                 <w:webHidden/>
               </w:rPr>
-              <w:t>11</w:t>
+              <w:t>10</w:t>
             </w:r>
             <w:r>
               <w:rPr>
@@ -2058,7 +2252,7 @@
               <w14:ligatures w14:val="standardContextual"/>
             </w:rPr>
           </w:pPr>
-          <w:hyperlink w:anchor="_Toc226575391" w:history="1">
+          <w:hyperlink w:anchor="_Toc226576192" w:history="1">
             <w:r>
               <w:rPr>
                 <w:rStyle w:val="Hyperlink"/>
@@ -2085,7 +2279,7 @@
                 <w:noProof/>
                 <w:webHidden/>
               </w:rPr>
-              <w:instrText xml:space="preserve"> PAGEREF _Toc226575391 \h </w:instrText>
+              <w:instrText xml:space="preserve"> PAGEREF _Toc226576192 \h </w:instrText>
             </w:r>
             <w:r>
               <w:rPr>
@@ -2130,7 +2324,7 @@
               <w14:ligatures w14:val="standardContextual"/>
             </w:rPr>
           </w:pPr>
-          <w:hyperlink w:anchor="_Toc226575392" w:history="1">
+          <w:hyperlink w:anchor="_Toc226576193" w:history="1">
             <w:r>
               <w:rPr>
                 <w:rStyle w:val="Hyperlink"/>
@@ -2157,7 +2351,7 @@
                 <w:noProof/>
                 <w:webHidden/>
               </w:rPr>
-              <w:instrText xml:space="preserve"> PAGEREF _Toc226575392 \h </w:instrText>
+              <w:instrText xml:space="preserve"> PAGEREF _Toc226576193 \h </w:instrText>
             </w:r>
             <w:r>
               <w:rPr>
@@ -2202,7 +2396,7 @@
               <w14:ligatures w14:val="standardContextual"/>
             </w:rPr>
           </w:pPr>
-          <w:hyperlink w:anchor="_Toc226575393" w:history="1">
+          <w:hyperlink w:anchor="_Toc226576194" w:history="1">
             <w:r>
               <w:rPr>
                 <w:rStyle w:val="Hyperlink"/>
@@ -2229,7 +2423,7 @@
                 <w:noProof/>
                 <w:webHidden/>
               </w:rPr>
-              <w:instrText xml:space="preserve"> PAGEREF _Toc226575393 \h </w:instrText>
+              <w:instrText xml:space="preserve"> PAGEREF _Toc226576194 \h </w:instrText>
             </w:r>
             <w:r>
               <w:rPr>
@@ -2274,7 +2468,7 @@
               <w14:ligatures w14:val="standardContextual"/>
             </w:rPr>
           </w:pPr>
-          <w:hyperlink w:anchor="_Toc226575394" w:history="1">
+          <w:hyperlink w:anchor="_Toc226576195" w:history="1">
             <w:r>
               <w:rPr>
                 <w:rStyle w:val="Hyperlink"/>
@@ -2301,7 +2495,7 @@
                 <w:noProof/>
                 <w:webHidden/>
               </w:rPr>
-              <w:instrText xml:space="preserve"> PAGEREF _Toc226575394 \h </w:instrText>
+              <w:instrText xml:space="preserve"> PAGEREF _Toc226576195 \h </w:instrText>
             </w:r>
             <w:r>
               <w:rPr>
@@ -2346,7 +2540,7 @@
               <w14:ligatures w14:val="standardContextual"/>
             </w:rPr>
           </w:pPr>
-          <w:hyperlink w:anchor="_Toc226575395" w:history="1">
+          <w:hyperlink w:anchor="_Toc226576196" w:history="1">
             <w:r>
               <w:rPr>
                 <w:rStyle w:val="Hyperlink"/>
@@ -2373,7 +2567,7 @@
                 <w:noProof/>
                 <w:webHidden/>
               </w:rPr>
-              <w:instrText xml:space="preserve"> PAGEREF _Toc226575395 \h </w:instrText>
+              <w:instrText xml:space="preserve"> PAGEREF _Toc226576196 \h </w:instrText>
             </w:r>
             <w:r>
               <w:rPr>
@@ -2418,7 +2612,7 @@
               <w14:ligatures w14:val="standardContextual"/>
             </w:rPr>
           </w:pPr>
-          <w:hyperlink w:anchor="_Toc226575396" w:history="1">
+          <w:hyperlink w:anchor="_Toc226576197" w:history="1">
             <w:r>
               <w:rPr>
                 <w:rStyle w:val="Hyperlink"/>
@@ -2445,7 +2639,7 @@
                 <w:noProof/>
                 <w:webHidden/>
               </w:rPr>
-              <w:instrText xml:space="preserve"> PAGEREF _Toc226575396 \h </w:instrText>
+              <w:instrText xml:space="preserve"> PAGEREF _Toc226576197 \h </w:instrText>
             </w:r>
             <w:r>
               <w:rPr>
@@ -2465,7 +2659,7 @@
                 <w:noProof/>
                 <w:webHidden/>
               </w:rPr>
-              <w:t>12</w:t>
+              <w:t>11</w:t>
             </w:r>
             <w:r>
               <w:rPr>
@@ -2490,7 +2684,7 @@
               <w14:ligatures w14:val="standardContextual"/>
             </w:rPr>
           </w:pPr>
-          <w:hyperlink w:anchor="_Toc226575397" w:history="1">
+          <w:hyperlink w:anchor="_Toc226576198" w:history="1">
             <w:r>
               <w:rPr>
                 <w:rStyle w:val="Hyperlink"/>
@@ -2517,7 +2711,7 @@
                 <w:noProof/>
                 <w:webHidden/>
               </w:rPr>
-              <w:instrText xml:space="preserve"> PAGEREF _Toc226575397 \h </w:instrText>
+              <w:instrText xml:space="preserve"> PAGEREF _Toc226576198 \h </w:instrText>
             </w:r>
             <w:r>
               <w:rPr>
@@ -2537,7 +2731,7 @@
                 <w:noProof/>
                 <w:webHidden/>
               </w:rPr>
-              <w:t>12</w:t>
+              <w:t>11</w:t>
             </w:r>
             <w:r>
               <w:rPr>
@@ -2562,7 +2756,7 @@
               <w14:ligatures w14:val="standardContextual"/>
             </w:rPr>
           </w:pPr>
-          <w:hyperlink w:anchor="_Toc226575398" w:history="1">
+          <w:hyperlink w:anchor="_Toc226576199" w:history="1">
             <w:r>
               <w:rPr>
                 <w:rStyle w:val="Hyperlink"/>
@@ -2589,7 +2783,7 @@
                 <w:noProof/>
                 <w:webHidden/>
               </w:rPr>
-              <w:instrText xml:space="preserve"> PAGEREF _Toc226575398 \h </w:instrText>
+              <w:instrText xml:space="preserve"> PAGEREF _Toc226576199 \h </w:instrText>
             </w:r>
             <w:r>
               <w:rPr>
@@ -2634,7 +2828,7 @@
               <w14:ligatures w14:val="standardContextual"/>
             </w:rPr>
           </w:pPr>
-          <w:hyperlink w:anchor="_Toc226575399" w:history="1">
+          <w:hyperlink w:anchor="_Toc226576200" w:history="1">
             <w:r>
               <w:rPr>
                 <w:rStyle w:val="Hyperlink"/>
@@ -2661,7 +2855,7 @@
                 <w:noProof/>
                 <w:webHidden/>
               </w:rPr>
-              <w:instrText xml:space="preserve"> PAGEREF _Toc226575399 \h </w:instrText>
+              <w:instrText xml:space="preserve"> PAGEREF _Toc226576200 \h </w:instrText>
             </w:r>
             <w:r>
               <w:rPr>
@@ -2706,7 +2900,7 @@
               <w14:ligatures w14:val="standardContextual"/>
             </w:rPr>
           </w:pPr>
-          <w:hyperlink w:anchor="_Toc226575400" w:history="1">
+          <w:hyperlink w:anchor="_Toc226576201" w:history="1">
             <w:r>
               <w:rPr>
                 <w:rStyle w:val="Hyperlink"/>
@@ -2733,7 +2927,7 @@
                 <w:noProof/>
                 <w:webHidden/>
               </w:rPr>
-              <w:instrText xml:space="preserve"> PAGEREF _Toc226575400 \h </w:instrText>
+              <w:instrText xml:space="preserve"> PAGEREF _Toc226576201 \h </w:instrText>
             </w:r>
             <w:r>
               <w:rPr>
@@ -2778,7 +2972,7 @@
               <w14:ligatures w14:val="standardContextual"/>
             </w:rPr>
           </w:pPr>
-          <w:hyperlink w:anchor="_Toc226575401" w:history="1">
+          <w:hyperlink w:anchor="_Toc226576202" w:history="1">
             <w:r>
               <w:rPr>
                 <w:rStyle w:val="Hyperlink"/>
@@ -2805,7 +2999,7 @@
                 <w:noProof/>
                 <w:webHidden/>
               </w:rPr>
-              <w:instrText xml:space="preserve"> PAGEREF _Toc226575401 \h </w:instrText>
+              <w:instrText xml:space="preserve"> PAGEREF _Toc226576202 \h </w:instrText>
             </w:r>
             <w:r>
               <w:rPr>
@@ -2850,7 +3044,7 @@
               <w14:ligatures w14:val="standardContextual"/>
             </w:rPr>
           </w:pPr>
-          <w:hyperlink w:anchor="_Toc226575402" w:history="1">
+          <w:hyperlink w:anchor="_Toc226576203" w:history="1">
             <w:r>
               <w:rPr>
                 <w:rStyle w:val="Hyperlink"/>
@@ -2877,7 +3071,7 @@
                 <w:noProof/>
                 <w:webHidden/>
               </w:rPr>
-              <w:instrText xml:space="preserve"> PAGEREF _Toc226575402 \h </w:instrText>
+              <w:instrText xml:space="preserve"> PAGEREF _Toc226576203 \h </w:instrText>
             </w:r>
             <w:r>
               <w:rPr>
@@ -2922,7 +3116,7 @@
               <w14:ligatures w14:val="standardContextual"/>
             </w:rPr>
           </w:pPr>
-          <w:hyperlink w:anchor="_Toc226575403" w:history="1">
+          <w:hyperlink w:anchor="_Toc226576204" w:history="1">
             <w:r>
               <w:rPr>
                 <w:rStyle w:val="Hyperlink"/>
@@ -2949,7 +3143,7 @@
                 <w:noProof/>
                 <w:webHidden/>
               </w:rPr>
-              <w:instrText xml:space="preserve"> PAGEREF _Toc226575403 \h </w:instrText>
+              <w:instrText xml:space="preserve"> PAGEREF _Toc226576204 \h </w:instrText>
             </w:r>
             <w:r>
               <w:rPr>
@@ -2996,8 +3190,8 @@
           <w:szCs w:val="32"/>
         </w:rPr>
       </w:pPr>
-      <w:bookmarkStart w:id="0" w:name="Xf4aeb7f742035ced212949c0dcd80ed41c53f65"/>
-      <w:bookmarkStart w:id="1" w:name="introduction-and-objectives"/>
+      <w:bookmarkStart w:id="0" w:name="introduction-and-objectives"/>
+      <w:bookmarkStart w:id="1" w:name="Xf4aeb7f742035ced212949c0dcd80ed41c53f65"/>
       <w:r>
         <w:rPr>
           <w:color w:val="4F81BD"/>
@@ -3011,7 +3205,7 @@
         <w:spacing w:before="240" w:after="120" w:line="320" w:lineRule="exact"/>
         <w:jc w:val="both"/>
       </w:pPr>
-      <w:bookmarkStart w:id="2" w:name="_Toc226575365"/>
+      <w:bookmarkStart w:id="2" w:name="_Toc226576166"/>
       <w:r>
         <w:rPr>
           <w:rFonts w:ascii="Aptos" w:hAnsi="Aptos"/>
@@ -3029,7 +3223,7 @@
         <w:jc w:val="both"/>
       </w:pPr>
       <w:bookmarkStart w:id="3" w:name="problem-statement"/>
-      <w:bookmarkStart w:id="4" w:name="_Toc226575366"/>
+      <w:bookmarkStart w:id="4" w:name="_Toc226576167"/>
       <w:r>
         <w:rPr>
           <w:color w:val="4F81BD"/>
@@ -3055,7 +3249,7 @@
         <w:jc w:val="both"/>
       </w:pPr>
       <w:bookmarkStart w:id="5" w:name="the-noted-platform"/>
-      <w:bookmarkStart w:id="6" w:name="_Toc226575367"/>
+      <w:bookmarkStart w:id="6" w:name="_Toc226576168"/>
       <w:bookmarkEnd w:id="3"/>
       <w:r>
         <w:rPr>
@@ -3121,7 +3315,7 @@
         <w:jc w:val="both"/>
       </w:pPr>
       <w:bookmarkStart w:id="7" w:name="project-scope-alignment"/>
-      <w:bookmarkStart w:id="8" w:name="_Toc226575368"/>
+      <w:bookmarkStart w:id="8" w:name="_Toc226576169"/>
       <w:bookmarkEnd w:id="5"/>
       <w:r>
         <w:rPr>
@@ -3599,8 +3793,8 @@
         <w:jc w:val="both"/>
       </w:pPr>
       <w:bookmarkStart w:id="9" w:name="infrastructure-and-containerization"/>
-      <w:bookmarkStart w:id="10" w:name="_Toc226575369"/>
-      <w:bookmarkEnd w:id="1"/>
+      <w:bookmarkStart w:id="10" w:name="_Toc226576170"/>
+      <w:bookmarkEnd w:id="0"/>
       <w:bookmarkEnd w:id="7"/>
       <w:r>
         <w:rPr>
@@ -3619,7 +3813,7 @@
         <w:jc w:val="both"/>
       </w:pPr>
       <w:bookmarkStart w:id="11" w:name="docker-compose-architecture"/>
-      <w:bookmarkStart w:id="12" w:name="_Toc226575370"/>
+      <w:bookmarkStart w:id="12" w:name="_Toc226576171"/>
       <w:r>
         <w:rPr>
           <w:color w:val="4F81BD"/>
@@ -4509,7 +4703,7 @@
         <w:jc w:val="both"/>
       </w:pPr>
       <w:bookmarkStart w:id="13" w:name="host-directory-mounts"/>
-      <w:bookmarkStart w:id="14" w:name="_Toc226575371"/>
+      <w:bookmarkStart w:id="14" w:name="_Toc226576172"/>
       <w:bookmarkEnd w:id="11"/>
       <w:r>
         <w:rPr>
@@ -4569,7 +4763,7 @@
         <w:jc w:val="both"/>
       </w:pPr>
       <w:bookmarkStart w:id="15" w:name="gpu-support"/>
-      <w:bookmarkStart w:id="16" w:name="_Toc226575372"/>
+      <w:bookmarkStart w:id="16" w:name="_Toc226576173"/>
       <w:bookmarkEnd w:id="13"/>
       <w:r>
         <w:rPr>
@@ -4597,7 +4791,7 @@
         <w:jc w:val="both"/>
       </w:pPr>
       <w:bookmarkStart w:id="17" w:name="X43fa1b2ca933eefcbb422c9792be1cc1cab1852"/>
-      <w:bookmarkStart w:id="18" w:name="_Toc226575373"/>
+      <w:bookmarkStart w:id="18" w:name="_Toc226576174"/>
       <w:bookmarkEnd w:id="9"/>
       <w:bookmarkEnd w:id="15"/>
       <w:r>
@@ -4616,7 +4810,7 @@
         <w:jc w:val="both"/>
       </w:pPr>
       <w:bookmarkStart w:id="19" w:name="reproducibility-guarantees"/>
-      <w:bookmarkStart w:id="20" w:name="_Toc226575374"/>
+      <w:bookmarkStart w:id="20" w:name="_Toc226576175"/>
       <w:r>
         <w:rPr>
           <w:color w:val="4F81BD"/>
@@ -4809,7 +5003,7 @@
         <w:jc w:val="both"/>
       </w:pPr>
       <w:bookmarkStart w:id="21" w:name="hydra-configuration"/>
-      <w:bookmarkStart w:id="22" w:name="_Toc226575375"/>
+      <w:bookmarkStart w:id="22" w:name="_Toc226576176"/>
       <w:bookmarkEnd w:id="19"/>
       <w:r>
         <w:rPr>
@@ -5090,7 +5284,7 @@
         <w:jc w:val="both"/>
       </w:pPr>
       <w:bookmarkStart w:id="23" w:name="pipeline-orchestration-apache-airflow"/>
-      <w:bookmarkStart w:id="24" w:name="_Toc226575376"/>
+      <w:bookmarkStart w:id="24" w:name="_Toc226576177"/>
       <w:bookmarkEnd w:id="17"/>
       <w:bookmarkEnd w:id="21"/>
       <w:r>
@@ -5109,7 +5303,7 @@
         <w:jc w:val="both"/>
       </w:pPr>
       <w:bookmarkStart w:id="25" w:name="dag-architecture"/>
-      <w:bookmarkStart w:id="26" w:name="_Toc226575377"/>
+      <w:bookmarkStart w:id="26" w:name="_Toc226576178"/>
       <w:r>
         <w:rPr>
           <w:color w:val="4F81BD"/>
@@ -5459,7 +5653,7 @@
         <w:jc w:val="both"/>
       </w:pPr>
       <w:bookmarkStart w:id="27" w:name="configuration-integration"/>
-      <w:bookmarkStart w:id="28" w:name="_Toc226575378"/>
+      <w:bookmarkStart w:id="28" w:name="_Toc226576179"/>
       <w:bookmarkEnd w:id="25"/>
       <w:r>
         <w:rPr>
@@ -5487,7 +5681,7 @@
         <w:jc w:val="both"/>
       </w:pPr>
       <w:bookmarkStart w:id="29" w:name="modular-source-code"/>
-      <w:bookmarkStart w:id="30" w:name="_Toc226575379"/>
+      <w:bookmarkStart w:id="30" w:name="_Toc226576180"/>
       <w:bookmarkEnd w:id="27"/>
       <w:r>
         <w:rPr>
@@ -5875,7 +6069,7 @@
         <w:jc w:val="both"/>
       </w:pPr>
       <w:bookmarkStart w:id="31" w:name="experiment-tracking-and-model-registry"/>
-      <w:bookmarkStart w:id="32" w:name="_Toc226575380"/>
+      <w:bookmarkStart w:id="32" w:name="_Toc226576181"/>
       <w:bookmarkEnd w:id="23"/>
       <w:bookmarkEnd w:id="29"/>
       <w:r>
@@ -5894,7 +6088,7 @@
         <w:jc w:val="both"/>
       </w:pPr>
       <w:bookmarkStart w:id="33" w:name="mlflow-integration"/>
-      <w:bookmarkStart w:id="34" w:name="_Toc226575381"/>
+      <w:bookmarkStart w:id="34" w:name="_Toc226576182"/>
       <w:r>
         <w:rPr>
           <w:color w:val="4F81BD"/>
@@ -6058,7 +6252,7 @@
         <w:jc w:val="both"/>
       </w:pPr>
       <w:bookmarkStart w:id="35" w:name="experiment-results"/>
-      <w:bookmarkStart w:id="36" w:name="_Toc226575382"/>
+      <w:bookmarkStart w:id="36" w:name="_Toc226576183"/>
       <w:bookmarkEnd w:id="33"/>
       <w:r>
         <w:rPr>
@@ -6549,7 +6743,7 @@
         <w:jc w:val="both"/>
       </w:pPr>
       <w:bookmarkStart w:id="37" w:name="Xf269e8d09728c3625167d33b45d415a33f90882"/>
-      <w:bookmarkStart w:id="38" w:name="_Toc226575383"/>
+      <w:bookmarkStart w:id="38" w:name="_Toc226576184"/>
       <w:bookmarkEnd w:id="35"/>
       <w:r>
         <w:rPr>
@@ -6661,7 +6855,7 @@
         <w:jc w:val="both"/>
       </w:pPr>
       <w:bookmarkStart w:id="39" w:name="model-serving-and-frontend"/>
-      <w:bookmarkStart w:id="40" w:name="_Toc226575384"/>
+      <w:bookmarkStart w:id="40" w:name="_Toc226576185"/>
       <w:bookmarkEnd w:id="31"/>
       <w:bookmarkEnd w:id="37"/>
       <w:r>
@@ -6680,7 +6874,7 @@
         <w:jc w:val="both"/>
       </w:pPr>
       <w:bookmarkStart w:id="41" w:name="fastapi-serving-layer"/>
-      <w:bookmarkStart w:id="42" w:name="_Toc226575385"/>
+      <w:bookmarkStart w:id="42" w:name="_Toc226576186"/>
       <w:r>
         <w:rPr>
           <w:color w:val="4F81BD"/>
@@ -6823,7 +7017,7 @@
         <w:jc w:val="both"/>
       </w:pPr>
       <w:bookmarkStart w:id="43" w:name="noted-try-it-panel"/>
-      <w:bookmarkStart w:id="44" w:name="_Toc226575386"/>
+      <w:bookmarkStart w:id="44" w:name="_Toc226576187"/>
       <w:bookmarkEnd w:id="41"/>
       <w:r>
         <w:rPr>
@@ -6851,7 +7045,7 @@
         <w:jc w:val="both"/>
       </w:pPr>
       <w:bookmarkStart w:id="45" w:name="jena-client-web-application"/>
-      <w:bookmarkStart w:id="46" w:name="_Toc226575387"/>
+      <w:bookmarkStart w:id="46" w:name="_Toc226576188"/>
       <w:bookmarkEnd w:id="43"/>
       <w:r>
         <w:rPr>
@@ -6983,7 +7177,7 @@
         <w:jc w:val="both"/>
       </w:pPr>
       <w:bookmarkStart w:id="47" w:name="ai-powered-development-assistant"/>
-      <w:bookmarkStart w:id="48" w:name="_Toc226575388"/>
+      <w:bookmarkStart w:id="48" w:name="_Toc226576189"/>
       <w:bookmarkEnd w:id="39"/>
       <w:bookmarkEnd w:id="45"/>
       <w:r>
@@ -7002,7 +7196,7 @@
         <w:jc w:val="both"/>
       </w:pPr>
       <w:bookmarkStart w:id="49" w:name="dual-backend-architecture"/>
-      <w:bookmarkStart w:id="50" w:name="_Toc226575389"/>
+      <w:bookmarkStart w:id="50" w:name="_Toc226576190"/>
       <w:r>
         <w:rPr>
           <w:color w:val="4F81BD"/>
@@ -7116,7 +7310,7 @@
         </w:rPr>
       </w:pPr>
       <w:bookmarkStart w:id="51" w:name="mcp-server-model-context-protocol"/>
-      <w:bookmarkStart w:id="52" w:name="_Toc226575390"/>
+      <w:bookmarkStart w:id="52" w:name="_Toc226576191"/>
       <w:bookmarkEnd w:id="49"/>
       <w:r>
         <w:rPr>
@@ -7218,7 +7412,7 @@
         <w:jc w:val="both"/>
       </w:pPr>
       <w:bookmarkStart w:id="53" w:name="tool-system"/>
-      <w:bookmarkStart w:id="54" w:name="_Toc226575391"/>
+      <w:bookmarkStart w:id="54" w:name="_Toc226576192"/>
       <w:bookmarkEnd w:id="51"/>
       <w:r>
         <w:rPr>
@@ -7255,7 +7449,7 @@
         <w:jc w:val="both"/>
       </w:pPr>
       <w:bookmarkStart w:id="55" w:name="web-content-fetch"/>
-      <w:bookmarkStart w:id="56" w:name="_Toc226575392"/>
+      <w:bookmarkStart w:id="56" w:name="_Toc226576193"/>
       <w:bookmarkEnd w:id="53"/>
       <w:r>
         <w:rPr>
@@ -7293,7 +7487,7 @@
         <w:jc w:val="both"/>
       </w:pPr>
       <w:bookmarkStart w:id="57" w:name="Xf028dbeea19278b734b0b35d66e607de6df3199"/>
-      <w:bookmarkStart w:id="58" w:name="_Toc226575393"/>
+      <w:bookmarkStart w:id="58" w:name="_Toc226576194"/>
       <w:bookmarkEnd w:id="47"/>
       <w:bookmarkEnd w:id="55"/>
       <w:r>
@@ -7322,7 +7516,7 @@
         <w:jc w:val="both"/>
       </w:pPr>
       <w:bookmarkStart w:id="59" w:name="step-1-configuration"/>
-      <w:bookmarkStart w:id="60" w:name="_Toc226575394"/>
+      <w:bookmarkStart w:id="60" w:name="_Toc226576195"/>
       <w:r>
         <w:rPr>
           <w:color w:val="4F81BD"/>
@@ -7381,7 +7575,7 @@
         <w:jc w:val="both"/>
       </w:pPr>
       <w:bookmarkStart w:id="61" w:name="step-2-pipeline-trigger"/>
-      <w:bookmarkStart w:id="62" w:name="_Toc226575395"/>
+      <w:bookmarkStart w:id="62" w:name="_Toc226576196"/>
       <w:bookmarkEnd w:id="59"/>
       <w:r>
         <w:rPr>
@@ -7419,7 +7613,7 @@
         <w:jc w:val="both"/>
       </w:pPr>
       <w:bookmarkStart w:id="63" w:name="step-3-live-monitoring"/>
-      <w:bookmarkStart w:id="64" w:name="_Toc226575396"/>
+      <w:bookmarkStart w:id="64" w:name="_Toc226576197"/>
       <w:bookmarkEnd w:id="61"/>
       <w:r>
         <w:rPr>
@@ -7446,7 +7640,7 @@
         <w:jc w:val="both"/>
       </w:pPr>
       <w:bookmarkStart w:id="65" w:name="step-4-verification"/>
-      <w:bookmarkStart w:id="66" w:name="_Toc226575397"/>
+      <w:bookmarkStart w:id="66" w:name="_Toc226576198"/>
       <w:bookmarkEnd w:id="63"/>
       <w:r>
         <w:rPr>
@@ -7473,7 +7667,7 @@
         <w:jc w:val="both"/>
       </w:pPr>
       <w:bookmarkStart w:id="67" w:name="step-5-auto-promotion"/>
-      <w:bookmarkStart w:id="68" w:name="_Toc226575398"/>
+      <w:bookmarkStart w:id="68" w:name="_Toc226576199"/>
       <w:bookmarkEnd w:id="65"/>
       <w:r>
         <w:rPr>
@@ -7523,7 +7717,7 @@
         <w:jc w:val="both"/>
       </w:pPr>
       <w:bookmarkStart w:id="69" w:name="step-6-prediction"/>
-      <w:bookmarkStart w:id="70" w:name="_Toc226575399"/>
+      <w:bookmarkStart w:id="70" w:name="_Toc226576200"/>
       <w:bookmarkEnd w:id="67"/>
       <w:r>
         <w:rPr>
@@ -7561,7 +7755,7 @@
         <w:jc w:val="both"/>
       </w:pPr>
       <w:bookmarkStart w:id="71" w:name="step-7-evidently-reports"/>
-      <w:bookmarkStart w:id="72" w:name="_Toc226575400"/>
+      <w:bookmarkStart w:id="72" w:name="_Toc226576201"/>
       <w:bookmarkEnd w:id="69"/>
       <w:r>
         <w:rPr>
@@ -7610,7 +7804,7 @@
         <w:jc w:val="both"/>
       </w:pPr>
       <w:bookmarkStart w:id="73" w:name="conclusion"/>
-      <w:bookmarkStart w:id="74" w:name="_Toc226575401"/>
+      <w:bookmarkStart w:id="74" w:name="_Toc226576202"/>
       <w:bookmarkEnd w:id="57"/>
       <w:bookmarkEnd w:id="71"/>
       <w:r>
@@ -7629,7 +7823,7 @@
         <w:jc w:val="both"/>
       </w:pPr>
       <w:bookmarkStart w:id="75" w:name="summary"/>
-      <w:bookmarkStart w:id="76" w:name="_Toc226575402"/>
+      <w:bookmarkStart w:id="76" w:name="_Toc226576203"/>
       <w:r>
         <w:rPr>
           <w:color w:val="4F81BD"/>
@@ -7791,7 +7985,7 @@
         <w:jc w:val="both"/>
       </w:pPr>
       <w:bookmarkStart w:id="77" w:name="future-enhancements"/>
-      <w:bookmarkStart w:id="78" w:name="_Toc226575403"/>
+      <w:bookmarkStart w:id="78" w:name="_Toc226576204"/>
       <w:bookmarkEnd w:id="75"/>
       <w:r>
         <w:rPr>
@@ -7948,13 +8142,13 @@
       <w:r>
         <w:t>: ghost-text suggestions via LLM integration</w:t>
       </w:r>
-      <w:bookmarkEnd w:id="0"/>
+      <w:bookmarkEnd w:id="1"/>
       <w:bookmarkEnd w:id="73"/>
       <w:bookmarkEnd w:id="77"/>
     </w:p>
     <w:sectPr>
-      <w:headerReference w:type="default" r:id="rId7"/>
-      <w:footerReference w:type="default" r:id="rId8"/>
+      <w:headerReference w:type="default" r:id="rId11"/>
+      <w:footerReference w:type="default" r:id="rId12"/>
       <w:footnotePr>
         <w:numRestart w:val="eachSect"/>
       </w:footnotePr>

</xml_diff>